<commit_message>
Atualiza portfolio, apresentacao final e termo com os documentos entregues
</commit_message>
<xml_diff>
--- a/docs/arquivos/Termo_de_Entrega_e_Recebimento_SCQ.docx
+++ b/docs/arquivos/Termo_de_Entrega_e_Recebimento_SCQ.docx
@@ -475,7 +475,7 @@
                 <w:sz w:val="21"/>
                 <w:szCs w:val="21"/>
               </w:rPr>
-              <w:t xml:space="preserve">Coordenação</w:t>
+              <w:t xml:space="preserve">Professor da disciplina</w:t>
             </w:r>
           </w:p>
         </w:tc>
@@ -500,7 +500,7 @@
                 <w:sz w:val="21"/>
                 <w:szCs w:val="21"/>
               </w:rPr>
-              <w:t xml:space="preserve">Prof.ª Me. Isabelle Cordova Gomes</w:t>
+              <w:t xml:space="preserve">Gabriel Christopher Dall'Pozzo</w:t>
             </w:r>
           </w:p>
         </w:tc>
@@ -783,7 +783,7 @@
           <w:sz w:val="22"/>
           <w:szCs w:val="22"/>
         </w:rPr>
-        <w:t xml:space="preserve">Documentação consolidada</w:t>
+        <w:t xml:space="preserve">Documentação Técnica e Acadêmica</w:t>
       </w:r>
     </w:p>
     <w:p>
@@ -799,7 +799,7 @@
           <w:sz w:val="20"/>
           <w:szCs w:val="20"/>
         </w:rPr>
-        <w:t xml:space="preserve">Documento único subdividido em Especificação de Requisitos, Arquitetura e Design, Manual do Usuário, Manual Técnico e Plano de Implantação</w:t>
+        <w:t xml:space="preserve">Documento principal do projeto: requisitos, modelagem, arquitetura, decisões técnicas, procedimentos de implantação e orientações de utilização, acompanhado dos diagramas UML (casos de uso, classes, componentes, implantação, sequência e entidade-relacionamento)</w:t>
       </w:r>
     </w:p>
     <w:p>
@@ -816,7 +816,7 @@
           <w:sz w:val="22"/>
           <w:szCs w:val="22"/>
         </w:rPr>
-        <w:t xml:space="preserve">Documentação técnica com diagramas</w:t>
+        <w:t xml:space="preserve">Relatório de Implantação</w:t>
       </w:r>
     </w:p>
     <w:p>
@@ -832,7 +832,7 @@
           <w:sz w:val="20"/>
           <w:szCs w:val="20"/>
         </w:rPr>
-        <w:t xml:space="preserve">Documentação acadêmica acompanhada dos diagramas UML (casos de uso, classes, componentes, implantação, sequência e entidade-relacionamento) e do arquivo-fonte de modelagem</w:t>
+        <w:t xml:space="preserve">Registro do processo de publicação em produção, dos desafios encontrados e das recomendações à entidade</w:t>
       </w:r>
     </w:p>
     <w:p>
@@ -849,7 +849,7 @@
           <w:sz w:val="22"/>
           <w:szCs w:val="22"/>
         </w:rPr>
-        <w:t xml:space="preserve">Guia Rápido de Uso</w:t>
+        <w:t xml:space="preserve">Relatórios das Sprints 1, 2 e 3</w:t>
       </w:r>
     </w:p>
     <w:p>
@@ -865,7 +865,7 @@
           <w:sz w:val="20"/>
           <w:szCs w:val="20"/>
         </w:rPr>
-        <w:t xml:space="preserve">Material de consulta rápida para o dia a dia dos usuários</w:t>
+        <w:t xml:space="preserve">Documentação do planejamento, das entregas, das métricas e das retrospectivas de cada ciclo</w:t>
       </w:r>
     </w:p>
     <w:p>
@@ -882,7 +882,7 @@
           <w:sz w:val="22"/>
           <w:szCs w:val="22"/>
         </w:rPr>
-        <w:t xml:space="preserve">Material de Treinamento</w:t>
+        <w:t xml:space="preserve">Backlog do produto</w:t>
       </w:r>
     </w:p>
     <w:p>
@@ -898,7 +898,7 @@
           <w:sz w:val="20"/>
           <w:szCs w:val="20"/>
         </w:rPr>
-        <w:t xml:space="preserve">Apresentação utilizada na capacitação dos funcionários da entidade</w:t>
+        <w:t xml:space="preserve">Relação das histórias de usuário e sua priorização</w:t>
       </w:r>
     </w:p>
     <w:p>
@@ -915,7 +915,7 @@
           <w:sz w:val="22"/>
           <w:szCs w:val="22"/>
         </w:rPr>
-        <w:t xml:space="preserve">Relatório de Implantação Piloto</w:t>
+        <w:t xml:space="preserve">Documento do Projeto</w:t>
       </w:r>
     </w:p>
     <w:p>
@@ -931,7 +931,7 @@
           <w:sz w:val="20"/>
           <w:szCs w:val="20"/>
         </w:rPr>
-        <w:t xml:space="preserve">Registro do processo de publicação em produção, dos desafios encontrados e das recomendações à entidade</w:t>
+        <w:t xml:space="preserve">Documento de concepção do produto, com o problema identificado na entidade, o escopo e a proposta de solução</w:t>
       </w:r>
     </w:p>
     <w:p>
@@ -948,7 +948,7 @@
           <w:sz w:val="22"/>
           <w:szCs w:val="22"/>
         </w:rPr>
-        <w:t xml:space="preserve">Relatórios das Sprints 1, 2 e 3</w:t>
+        <w:t xml:space="preserve">Lista de Ajustes e Melhorias</w:t>
       </w:r>
     </w:p>
     <w:p>
@@ -964,7 +964,7 @@
           <w:sz w:val="20"/>
           <w:szCs w:val="20"/>
         </w:rPr>
-        <w:t xml:space="preserve">Documentação do planejamento, das entregas, das métricas e das retrospectivas de cada ciclo</w:t>
+        <w:t xml:space="preserve">Registro dos ajustes solicitados pela entidade durante a validação</w:t>
       </w:r>
     </w:p>
     <w:p>
@@ -981,7 +981,7 @@
           <w:sz w:val="22"/>
           <w:szCs w:val="22"/>
         </w:rPr>
-        <w:t xml:space="preserve">Backlog do produto</w:t>
+        <w:t xml:space="preserve">Apresentação Final</w:t>
       </w:r>
     </w:p>
     <w:p>
@@ -997,7 +997,7 @@
           <w:sz w:val="20"/>
           <w:szCs w:val="20"/>
         </w:rPr>
-        <w:t xml:space="preserve">Relação das histórias de usuário e sua priorização</w:t>
+        <w:t xml:space="preserve">Arquivo da apresentação de encerramento do projeto</w:t>
       </w:r>
     </w:p>
     <w:p>
@@ -1014,7 +1014,7 @@
           <w:sz w:val="22"/>
           <w:szCs w:val="22"/>
         </w:rPr>
-        <w:t xml:space="preserve">Lista de Ajustes e Melhorias</w:t>
+        <w:t xml:space="preserve">Portfólio digital do projeto</w:t>
       </w:r>
     </w:p>
     <w:p>
@@ -1030,73 +1030,7 @@
           <w:sz w:val="20"/>
           <w:szCs w:val="20"/>
         </w:rPr>
-        <w:t xml:space="preserve">Registro dos ajustes solicitados pela entidade durante a validação</w:t>
-      </w:r>
-    </w:p>
-    <w:p>
-      <w:pPr>
-        <w:keepNext/>
-        <w:spacing w:after="20" w:before="130"/>
-      </w:pPr>
-      <w:r>
-        <w:rPr>
-          <w:rFonts w:ascii="Calibri" w:cs="Calibri" w:eastAsia="Calibri" w:hAnsi="Calibri"/>
-          <w:b/>
-          <w:bCs/>
-          <w:color w:val="1F2937"/>
-          <w:sz w:val="22"/>
-          <w:szCs w:val="22"/>
-        </w:rPr>
-        <w:t xml:space="preserve">Carga do histórico</w:t>
-      </w:r>
-    </w:p>
-    <w:p>
-      <w:pPr>
-        <w:spacing w:after="0" w:line="260"/>
-        <w:ind w:left="28"/>
-        <w:jc w:val="both"/>
-      </w:pPr>
-      <w:r>
-        <w:rPr>
-          <w:rFonts w:ascii="Calibri" w:cs="Calibri" w:eastAsia="Calibri" w:hAnsi="Calibri"/>
-          <w:color w:val="555555"/>
-          <w:sz w:val="20"/>
-          <w:szCs w:val="20"/>
-        </w:rPr>
-        <w:t xml:space="preserve">Importação de 1.414 análises e 37 lotes, referentes ao período de novembro de 2025 a setembro de 2026, com os scripts de importação versionados no repositório</w:t>
-      </w:r>
-    </w:p>
-    <w:p>
-      <w:pPr>
-        <w:keepNext/>
-        <w:spacing w:after="20" w:before="130"/>
-      </w:pPr>
-      <w:r>
-        <w:rPr>
-          <w:rFonts w:ascii="Calibri" w:cs="Calibri" w:eastAsia="Calibri" w:hAnsi="Calibri"/>
-          <w:b/>
-          <w:bCs/>
-          <w:color w:val="1F2937"/>
-          <w:sz w:val="22"/>
-          <w:szCs w:val="22"/>
-        </w:rPr>
-        <w:t xml:space="preserve">Apresentação Final</w:t>
-      </w:r>
-    </w:p>
-    <w:p>
-      <w:pPr>
-        <w:spacing w:after="0" w:line="260"/>
-        <w:ind w:left="28"/>
-        <w:jc w:val="both"/>
-      </w:pPr>
-      <w:r>
-        <w:rPr>
-          <w:rFonts w:ascii="Calibri" w:cs="Calibri" w:eastAsia="Calibri" w:hAnsi="Calibri"/>
-          <w:color w:val="555555"/>
-          <w:sz w:val="20"/>
-          <w:szCs w:val="20"/>
-        </w:rPr>
-        <w:t xml:space="preserve">Arquivo da apresentação de encerramento do projeto</w:t>
+        <w:t xml:space="preserve">Página pública reunindo todos os artefatos do projeto para consulta e download: jp-ortolan.github.io/Sistema-controle-qualidade-verdelandia</w:t>
       </w:r>
     </w:p>
     <w:p>
@@ -1160,7 +1094,7 @@
           <w:sz w:val="22"/>
           <w:szCs w:val="22"/>
         </w:rPr>
-        <w:t xml:space="preserve">Declara, ainda, estar ciente das recomendações registradas no Relatório de Implantação Piloto, em especial quanto à adoção de rotina periódica de backup do banco de dados e ao acompanhamento dos planos de hospedagem contratados.</w:t>
+        <w:t xml:space="preserve">Declara, ainda, estar ciente das recomendações registradas no Relatório de Implantação, em especial quanto à adoção de rotina periódica de backup do banco de dados e ao acompanhamento dos planos de hospedagem contratados.</w:t>
       </w:r>
     </w:p>
     <w:p>
@@ -1471,7 +1405,7 @@
           <w:sz w:val="21"/>
           <w:szCs w:val="21"/>
         </w:rPr>
-        <w:t xml:space="preserve">Prof.ª Me. Isabelle Cordova Gomes</w:t>
+        <w:t xml:space="preserve">Gabriel Christopher Dall'Pozzo</w:t>
       </w:r>
     </w:p>
     <w:p>
@@ -1485,7 +1419,7 @@
           <w:sz w:val="19"/>
           <w:szCs w:val="19"/>
         </w:rPr>
-        <w:t xml:space="preserve">Coordenadora do Curso de Engenharia de Software — Centro Universitário Campo Real</w:t>
+        <w:t xml:space="preserve">Professor da Disciplina de Extensão — Centro Universitário Campo Real</w:t>
       </w:r>
     </w:p>
     <w:sectPr>

</xml_diff>

<commit_message>
Alinha portfolio, termo e apresentacao com os sete itens entregues
</commit_message>
<xml_diff>
--- a/docs/arquivos/Termo_de_Entrega_e_Recebimento_SCQ.docx
+++ b/docs/arquivos/Termo_de_Entrega_e_Recebimento_SCQ.docx
@@ -824,7 +824,7 @@
           <w:sz w:val="23"/>
           <w:szCs w:val="23"/>
         </w:rPr>
-        <w:t xml:space="preserve">3.5 Backlog do Produto</w:t>
+        <w:t xml:space="preserve">3.5 Lista de Ajustes e Melhorias</w:t>
       </w:r>
     </w:p>
     <w:p>
@@ -839,7 +839,7 @@
           <w:sz w:val="22"/>
           <w:szCs w:val="22"/>
         </w:rPr>
-        <w:t xml:space="preserve">Relação completa das histórias de usuário, com descrição, pontuação e a sprint em que cada uma foi desenvolvida.</w:t>
+        <w:t xml:space="preserve">Registro dos ajustes solicitados pela entidade durante a fase de validação, com a história de usuário correspondente, a origem do feedback e a prioridade atribuída.</w:t>
       </w:r>
     </w:p>
     <w:p>
@@ -856,7 +856,7 @@
           <w:sz w:val="23"/>
           <w:szCs w:val="23"/>
         </w:rPr>
-        <w:t xml:space="preserve">3.6 Lista de Ajustes e Melhorias</w:t>
+        <w:t xml:space="preserve">3.6 Relatório de Implantação</w:t>
       </w:r>
     </w:p>
     <w:p>
@@ -871,7 +871,7 @@
           <w:sz w:val="22"/>
           <w:szCs w:val="22"/>
         </w:rPr>
-        <w:t xml:space="preserve">Registro dos ajustes solicitados pela entidade durante a fase de validação, com a história de usuário correspondente, a origem do feedback e a prioridade atribuída.</w:t>
+        <w:t xml:space="preserve">Registro do processo de publicação em ambiente de produção, dos obstáculos enfrentados, das soluções aplicadas, do estado atual do sistema e das recomendações dirigidas à entidade.</w:t>
       </w:r>
     </w:p>
     <w:p>
@@ -888,7 +888,7 @@
           <w:sz w:val="23"/>
           <w:szCs w:val="23"/>
         </w:rPr>
-        <w:t xml:space="preserve">3.7 Relatório de Implantação</w:t>
+        <w:t xml:space="preserve">3.7 Apresentação Final</w:t>
       </w:r>
     </w:p>
     <w:p>
@@ -903,103 +903,7 @@
           <w:sz w:val="22"/>
           <w:szCs w:val="22"/>
         </w:rPr>
-        <w:t xml:space="preserve">Registro do processo de publicação em ambiente de produção, dos obstáculos enfrentados, das soluções aplicadas, do estado atual do sistema e das recomendações dirigidas à entidade.</w:t>
-      </w:r>
-    </w:p>
-    <w:p>
-      <w:pPr>
-        <w:keepNext/>
-        <w:spacing w:after="30" w:before="140"/>
-        <w:ind w:left="360" w:hanging="360"/>
-      </w:pPr>
-      <w:r>
-        <w:rPr>
-          <w:rFonts w:ascii="Times New Roman" w:cs="Times New Roman" w:eastAsia="Times New Roman" w:hAnsi="Times New Roman"/>
-          <w:b/>
-          <w:bCs/>
-          <w:sz w:val="23"/>
-          <w:szCs w:val="23"/>
-        </w:rPr>
-        <w:t xml:space="preserve">3.8 Relatórios das Sprints 1, 2 e 3</w:t>
-      </w:r>
-    </w:p>
-    <w:p>
-      <w:pPr>
-        <w:spacing w:after="0" w:line="264"/>
-        <w:ind w:left="360"/>
-        <w:jc w:val="both"/>
-      </w:pPr>
-      <w:r>
-        <w:rPr>
-          <w:rFonts w:ascii="Times New Roman" w:cs="Times New Roman" w:eastAsia="Times New Roman" w:hAnsi="Times New Roman"/>
-          <w:sz w:val="22"/>
-          <w:szCs w:val="22"/>
-        </w:rPr>
-        <w:t xml:space="preserve">Documentação do planejamento, das entregas, das métricas e das retrospectivas de cada ciclo de desenvolvimento.</w:t>
-      </w:r>
-    </w:p>
-    <w:p>
-      <w:pPr>
-        <w:keepNext/>
-        <w:spacing w:after="30" w:before="140"/>
-        <w:ind w:left="360" w:hanging="360"/>
-      </w:pPr>
-      <w:r>
-        <w:rPr>
-          <w:rFonts w:ascii="Times New Roman" w:cs="Times New Roman" w:eastAsia="Times New Roman" w:hAnsi="Times New Roman"/>
-          <w:b/>
-          <w:bCs/>
-          <w:sz w:val="23"/>
-          <w:szCs w:val="23"/>
-        </w:rPr>
-        <w:t xml:space="preserve">3.9 Apresentação Final</w:t>
-      </w:r>
-    </w:p>
-    <w:p>
-      <w:pPr>
-        <w:spacing w:after="0" w:line="264"/>
-        <w:ind w:left="360"/>
-        <w:jc w:val="both"/>
-      </w:pPr>
-      <w:r>
-        <w:rPr>
-          <w:rFonts w:ascii="Times New Roman" w:cs="Times New Roman" w:eastAsia="Times New Roman" w:hAnsi="Times New Roman"/>
-          <w:sz w:val="22"/>
-          <w:szCs w:val="22"/>
-        </w:rPr>
         <w:t xml:space="preserve">Arquivo da apresentação de encerramento do projeto.</w:t>
-      </w:r>
-    </w:p>
-    <w:p>
-      <w:pPr>
-        <w:keepNext/>
-        <w:spacing w:after="30" w:before="140"/>
-        <w:ind w:left="360" w:hanging="360"/>
-      </w:pPr>
-      <w:r>
-        <w:rPr>
-          <w:rFonts w:ascii="Times New Roman" w:cs="Times New Roman" w:eastAsia="Times New Roman" w:hAnsi="Times New Roman"/>
-          <w:b/>
-          <w:bCs/>
-          <w:sz w:val="23"/>
-          <w:szCs w:val="23"/>
-        </w:rPr>
-        <w:t xml:space="preserve">3.10 Portfólio digital</w:t>
-      </w:r>
-    </w:p>
-    <w:p>
-      <w:pPr>
-        <w:spacing w:after="0" w:line="264"/>
-        <w:ind w:left="360"/>
-        <w:jc w:val="both"/>
-      </w:pPr>
-      <w:r>
-        <w:rPr>
-          <w:rFonts w:ascii="Times New Roman" w:cs="Times New Roman" w:eastAsia="Times New Roman" w:hAnsi="Times New Roman"/>
-          <w:sz w:val="22"/>
-          <w:szCs w:val="22"/>
-        </w:rPr>
-        <w:t xml:space="preserve">Página pública reunindo os artefatos do projeto para consulta e download.</w:t>
       </w:r>
     </w:p>
     <w:p>

</xml_diff>